<commit_message>
Fill in team details: student names, registration numbers, and project guide
Co-Authored-By: Claude Sonnet 5 <noreply@anthropic.com>
</commit_message>
<xml_diff>
--- a/docs/Report_Ch1-3_RAG_VulnDetection.docx
+++ b/docs/Report_Ch1-3_RAG_VulnDetection.docx
@@ -157,7 +157,7 @@
         <w:pStyle w:val="BodyText"/>
       </w:pPr>
       <w:r>
-        <w:t xml:space="preserve">[Student Name — Registration Number]</w:t>
+        <w:t xml:space="preserve">Aakash Sivakumar — 23BCE5119</w:t>
       </w:r>
     </w:p>
     <w:p>
@@ -165,17 +165,7 @@
         <w:pStyle w:val="BodyText"/>
       </w:pPr>
       <w:r>
-        <w:t xml:space="preserve">[Student Name — Registration Number]</w:t>
-      </w:r>
-      <w:r>
-        <w:t xml:space="preserve"> </w:t>
-      </w:r>
-      <w:r>
-        <w:rPr>
-          <w:iCs/>
-          <w:i/>
-        </w:rPr>
-        <w:t xml:space="preserve">(if team project)</w:t>
+        <w:t xml:space="preserve">Udhay Anand Pandiyan — 23BCE1793</w:t>
       </w:r>
     </w:p>
     <w:p>
@@ -183,17 +173,17 @@
         <w:pStyle w:val="BodyText"/>
       </w:pPr>
       <w:r>
-        <w:t xml:space="preserve">[Student Name — Registration Number]</w:t>
-      </w:r>
-      <w:r>
-        <w:t xml:space="preserve"> </w:t>
-      </w:r>
-      <w:r>
-        <w:rPr>
-          <w:iCs/>
-          <w:i/>
-        </w:rPr>
-        <w:t xml:space="preserve">(if team project)</w:t>
+        <w:rPr>
+          <w:bCs/>
+          <w:b/>
+        </w:rPr>
+        <w:t xml:space="preserve">Programme:</w:t>
+      </w:r>
+      <w:r>
+        <w:t xml:space="preserve"> </w:t>
+      </w:r>
+      <w:r>
+        <w:t xml:space="preserve">B.Tech. Computer Science and Engineering</w:t>
       </w:r>
     </w:p>
     <w:p>
@@ -205,13 +195,13 @@
           <w:bCs/>
           <w:b/>
         </w:rPr>
-        <w:t xml:space="preserve">Programme:</w:t>
-      </w:r>
-      <w:r>
-        <w:t xml:space="preserve"> </w:t>
-      </w:r>
-      <w:r>
-        <w:t xml:space="preserve">B.Tech. Computer Science and Engineering</w:t>
+        <w:t xml:space="preserve">Guide:</w:t>
+      </w:r>
+      <w:r>
+        <w:t xml:space="preserve"> </w:t>
+      </w:r>
+      <w:r>
+        <w:t xml:space="preserve">Jenila Livingston L M</w:t>
       </w:r>
     </w:p>
     <w:p>
@@ -223,24 +213,6 @@
           <w:bCs/>
           <w:b/>
         </w:rPr>
-        <w:t xml:space="preserve">Guide:</w:t>
-      </w:r>
-      <w:r>
-        <w:t xml:space="preserve"> </w:t>
-      </w:r>
-      <w:r>
-        <w:t xml:space="preserve">[Project Guide Name]</w:t>
-      </w:r>
-    </w:p>
-    <w:p>
-      <w:pPr>
-        <w:pStyle w:val="BodyText"/>
-      </w:pPr>
-      <w:r>
-        <w:rPr>
-          <w:bCs/>
-          <w:b/>
-        </w:rPr>
         <w:t xml:space="preserve">Review Date:</w:t>
       </w:r>
       <w:r>
@@ -248,18 +220,6 @@
       </w:r>
       <w:r>
         <w:t xml:space="preserve">19 August 2026</w:t>
-      </w:r>
-    </w:p>
-    <w:p>
-      <w:pPr>
-        <w:pStyle w:val="BodyText"/>
-      </w:pPr>
-      <w:r>
-        <w:rPr>
-          <w:iCs/>
-          <w:i/>
-        </w:rPr>
-        <w:t xml:space="preserve">(Fields in brackets to be filled in before submission/printing.)</w:t>
       </w:r>
     </w:p>
     <w:bookmarkEnd w:id="23"/>

</xml_diff>